<commit_message>
docs(to-prd): clarify design inputs and PRD output paths in v1.3 handbook
</commit_message>
<xml_diff>
--- a/to-prd/assets/brief/PRD작성핸드북_v1.3.docx
+++ b/to-prd/assets/brief/PRD작성핸드북_v1.3.docx
@@ -89,6 +89,12 @@
       </w:r>
     </w:p>
     <w:p>
+      <w:pPr/>
+      <w:r>
+        <w:t>기존 DESIGN.md 파일이 있으면 그 위치를 알려주세요. 없으면 Apple의 DESIGN.md를 프로젝트의 디자인 기준으로 사용합니다.</w:t>
+      </w:r>
+    </w:p>
+    <w:p>
       <w:pPr>
         <w:pStyle w:val="Heading2"/>
       </w:pPr>
@@ -130,7 +136,13 @@
     <w:p>
       <w:pPr/>
       <w:r>
-        <w:t>docs/PRD.html을 열어 다음 내용을 확인합니다.</w:t>
+        <w:t>최종 결과물은 프로젝트 디렉토리의 docs/prd.md에 저장하고, 사람이 읽기 편하도록 docs/prd.html도 만듭니다.</w:t>
+      </w:r>
+    </w:p>
+    <w:p>
+      <w:pPr/>
+      <w:r>
+        <w:t>docs/prd.html을 열어 다음 내용을 확인합니다.</w:t>
       </w:r>
     </w:p>
     <w:p>
@@ -172,7 +184,7 @@
     <w:p>
       <w:pPr/>
       <w:r>
-        <w:t>PRD.html은 검토용이며, docs/PRD.md가 정본입니다. 수정은 to-prd에 요청합니다.</w:t>
+        <w:t>prd.html은 검토용이며, docs/prd.md가 정본입니다. 수정은 to-prd에 요청합니다.</w:t>
       </w:r>
     </w:p>
     <w:p>

</xml_diff>